<commit_message>
Livraison par module, mvn verify, README, renvois CC
</commit_message>
<xml_diff>
--- a/_support/supports_par_modules/Couleur/Support_ITF.docx
+++ b/_support/supports_par_modules/Couleur/Support_ITF.docx
@@ -2389,7 +2389,39 @@
                 <w:sz w:val="22"/>
                 <w:szCs w:val="22"/>
               </w:rPr>
-              <w:t xml:space="preserve"> sur un de ses éléments, et lisez ce que dit le compilateur. Voir </w:t>
+              <w:t xml:space="preserve"> sur un de ses éléments, et lisez ce que dit le compilateur : une variable de type </w:t>
+            </w:r>
+            <w:r>
+              <w:rPr>
+                <w:rFonts w:ascii="Consolas" w:hAnsi="Consolas" w:cs="Consolas"/>
+                <w:color w:val="E97132" w:themeColor="accent2"/>
+                <w:sz w:val="18"/>
+                <w:szCs w:val="18"/>
+              </w:rPr>
+              <w:t xml:space="preserve">Translatable</w:t>
+            </w:r>
+            <w:r>
+              <w:rPr>
+                <w:sz w:val="22"/>
+                <w:szCs w:val="22"/>
+              </w:rPr>
+              <w:t xml:space="preserve"> ne connaît que ce que promet l'interface, même si l'objet qu'elle désigne sait faire davantage. La dernière question de l'énoncé reste ouverte : la normalisation de l'angle, déjà écrite en </w:t>
+            </w:r>
+            <w:r>
+              <w:rPr>
+                <w:rFonts w:ascii="Consolas" w:hAnsi="Consolas" w:cs="Consolas"/>
+                <w:color w:val="E97132" w:themeColor="accent2"/>
+                <w:sz w:val="18"/>
+                <w:szCs w:val="18"/>
+              </w:rPr>
+              <w:t xml:space="preserve">ABS.1</w:t>
+            </w:r>
+            <w:r>
+              <w:rPr>
+                <w:sz w:val="22"/>
+                <w:szCs w:val="22"/>
+              </w:rPr>
+              <w:t xml:space="preserve">, réapparaît ici ; est-ce une duplication au sens de </w:t>
             </w:r>
             <w:r>
               <w:rPr>
@@ -2406,7 +2438,7 @@
                 <w:sz w:val="22"/>
                 <w:szCs w:val="22"/>
               </w:rPr>
-              <w:t xml:space="preserve">.</w:t>
+              <w:t xml:space="preserve"> ?</w:t>
             </w:r>
           </w:p>
         </w:tc>

</xml_diff>